<commit_message>
setup.ps1: disable AD DS before enabling Entra Kerberos
</commit_message>
<xml_diff>
--- a/docs/participant-workbook-session2.docx
+++ b/docs/participant-workbook-session2.docx
@@ -1069,6 +1069,89 @@
       </w:r>
       <w:r>
         <w:t xml:space="preserve">remaining manual step.</w:t>
+      </w:r>
+    </w:p>
+    <w:p>
+      <w:pPr>
+        <w:pStyle w:val="BodyText"/>
+      </w:pPr>
+      <w:r>
+        <w:rPr>
+          <w:b/>
+        </w:rPr>
+        <w:t xml:space="preserve">Why:</w:t>
+      </w:r>
+      <w:r>
+        <w:t xml:space="preserve"> </w:t>
+      </w:r>
+      <w:r>
+        <w:t xml:space="preserve">a storage account can use only</w:t>
+      </w:r>
+      <w:r>
+        <w:t xml:space="preserve"> </w:t>
+      </w:r>
+      <w:r>
+        <w:rPr>
+          <w:b/>
+        </w:rPr>
+        <w:t xml:space="preserve">one</w:t>
+      </w:r>
+      <w:r>
+        <w:t xml:space="preserve"> </w:t>
+      </w:r>
+      <w:r>
+        <w:t xml:space="preserve">identity source at a time, so</w:t>
+      </w:r>
+      <w:r>
+        <w:t xml:space="preserve"> </w:t>
+      </w:r>
+      <w:r>
+        <w:t xml:space="preserve">the script first</w:t>
+      </w:r>
+      <w:r>
+        <w:t xml:space="preserve"> </w:t>
+      </w:r>
+      <w:r>
+        <w:rPr>
+          <w:b/>
+        </w:rPr>
+        <w:t xml:space="preserve">disables the Session 1 AD DS auth</w:t>
+      </w:r>
+      <w:r>
+        <w:t xml:space="preserve">, then enables Entra</w:t>
+      </w:r>
+      <w:r>
+        <w:t xml:space="preserve"> </w:t>
+      </w:r>
+      <w:r>
+        <w:t xml:space="preserve">Kerberos on the same account. Everything else from Session 1 is reused as-is —</w:t>
+      </w:r>
+      <w:r>
+        <w:t xml:space="preserve"> </w:t>
+      </w:r>
+      <w:r>
+        <w:t xml:space="preserve">the DC, the domain-joined client, and the</w:t>
+      </w:r>
+      <w:r>
+        <w:t xml:space="preserve"> </w:t>
+      </w:r>
+      <w:r>
+        <w:rPr>
+          <w:rStyle w:val="VerbatimChar"/>
+        </w:rPr>
+        <w:t xml:space="preserve">labuser1</w:t>
+      </w:r>
+      <w:r>
+        <w:t xml:space="preserve"> </w:t>
+      </w:r>
+      <w:r>
+        <w:t xml:space="preserve">account (which Cloud Sync</w:t>
+      </w:r>
+      <w:r>
+        <w:t xml:space="preserve"> </w:t>
+      </w:r>
+      <w:r>
+        <w:t xml:space="preserve">turns into a hybrid identity in the next step).</w:t>
       </w:r>
     </w:p>
     <w:p>

</xml_diff>